<commit_message>
electronic: V4 main board refresh
Updated KiCad project files, board notes and BOM, a combined board image, and
KiCad's backup folder. The stale fp-info-cache is dropped.

Co-Authored-By: Claude Opus 5 <noreply@anthropic.com>
</commit_message>
<xml_diff>
--- a/Electronic/SimInvent_PCBs/Main_Board/NOTES FOR V4 Board.docx
+++ b/Electronic/SimInvent_PCBs/Main_Board/NOTES FOR V4 Board.docx
@@ -235,21 +235,7 @@
         <w:rPr>
           <w:rFonts w:ascii="Calibri" w:eastAsia="Times New Roman" w:hAnsi="Calibri" w:cs="Calibri"/>
         </w:rPr>
-        <w:t>D1/D2 is optional but is recommended to protect the transistor from inductive flyback from the buzzer.  (</w:t>
-      </w:r>
-      <w:proofErr w:type="gramStart"/>
-      <w:r>
-        <w:rPr>
-          <w:rFonts w:ascii="Calibri" w:eastAsia="Times New Roman" w:hAnsi="Calibri" w:cs="Calibri"/>
-        </w:rPr>
-        <w:t>install</w:t>
-      </w:r>
-      <w:proofErr w:type="gramEnd"/>
-      <w:r>
-        <w:rPr>
-          <w:rFonts w:ascii="Calibri" w:eastAsia="Times New Roman" w:hAnsi="Calibri" w:cs="Calibri"/>
-        </w:rPr>
-        <w:t xml:space="preserve"> either D1 THT or D2 SMD)</w:t>
+        <w:t>Do not populate D1/D2.  This diode is not needed can interfere with Error LED and Buzzer.</w:t>
       </w:r>
     </w:p>
     <w:p>

</xml_diff>